<commit_message>
primeiros ajustes para as variáveis do DOCX
</commit_message>
<xml_diff>
--- a/media/doc/modelo_df.docx
+++ b/media/doc/modelo_df.docx
@@ -152,7 +152,19 @@
         <w:rPr>
           <w:highlight w:val="cyan"/>
         </w:rPr>
-        <w:t>O Matteh Fundo de Investimento em Direitos Creditórios (“Fundo”), é um fundo de investimento em direitos creditórios constituído sob a forma de condomínio especial fechado, iniciou suas atividades em 10 de janeiro de 2025, com prazo de duração indeterminado, regido por seu Regulamento (“Regulamento”), pela Resolução CMN 2.907, pela Resolução CVM 175 e pelas demais disposições legais e regulamentares que lhe forem aplicáveis.</w:t>
+        <w:t xml:space="preserve">O Matteh Fundo de Investimento em Direitos Creditórios (“Fundo”), é um fundo de investimento em direitos creditórios constituído sob a forma de condomínio especial fechado, iniciou suas atividades em </w:t>
+      </w:r>
+      <w:r>
+        <w:rPr>
+          <w:highlight w:val="cyan"/>
+        </w:rPr>
+        <w:t>{{data_anterior_extenso}}</w:t>
+      </w:r>
+      <w:r>
+        <w:rPr>
+          <w:highlight w:val="cyan"/>
+        </w:rPr>
+        <w:t>, com prazo de duração indeterminado, regido por seu Regulamento (“Regulamento”), pela Resolução CMN 2.907, pela Resolução CVM 175 e pelas demais disposições legais e regulamentares que lhe forem aplicáveis.</w:t>
       </w:r>
     </w:p>
     <w:p>
@@ -545,7 +557,67 @@
           <w:highlight w:val="cyan"/>
           <w:lang w:val="pt-BR"/>
         </w:rPr>
-        <w:t xml:space="preserve">período de 10 de janeiro de 2025 (início das atividades) a 31 de agosto de 2025, motivo pelo qual não são comparativas, </w:t>
+        <w:t xml:space="preserve">período de </w:t>
+      </w:r>
+      <w:r>
+        <w:rPr>
+          <w:highlight w:val="cyan"/>
+          <w:lang w:val="pt-BR"/>
+        </w:rPr>
+        <w:t>{{</w:t>
+      </w:r>
+      <w:proofErr w:type="spellStart"/>
+      <w:r>
+        <w:rPr>
+          <w:highlight w:val="cyan"/>
+          <w:lang w:val="pt-BR"/>
+        </w:rPr>
+        <w:t>data_anterior_extenso</w:t>
+      </w:r>
+      <w:proofErr w:type="spellEnd"/>
+      <w:r>
+        <w:rPr>
+          <w:highlight w:val="cyan"/>
+          <w:lang w:val="pt-BR"/>
+        </w:rPr>
+        <w:t>}}</w:t>
+      </w:r>
+      <w:r>
+        <w:rPr>
+          <w:highlight w:val="cyan"/>
+          <w:lang w:val="pt-BR"/>
+        </w:rPr>
+        <w:t xml:space="preserve"> (início das atividades) a </w:t>
+      </w:r>
+      <w:r>
+        <w:rPr>
+          <w:highlight w:val="cyan"/>
+          <w:lang w:val="pt-BR"/>
+        </w:rPr>
+        <w:t>{{</w:t>
+      </w:r>
+      <w:proofErr w:type="spellStart"/>
+      <w:r>
+        <w:rPr>
+          <w:highlight w:val="cyan"/>
+          <w:lang w:val="pt-BR"/>
+        </w:rPr>
+        <w:t>data_atual_extenso</w:t>
+      </w:r>
+      <w:proofErr w:type="spellEnd"/>
+      <w:r>
+        <w:rPr>
+          <w:highlight w:val="cyan"/>
+          <w:lang w:val="pt-BR"/>
+        </w:rPr>
+        <w:t>}}</w:t>
+      </w:r>
+      <w:r>
+        <w:rPr>
+          <w:highlight w:val="cyan"/>
+          <w:lang w:val="pt-BR"/>
+        </w:rPr>
+        <w:t xml:space="preserve">, motivo pelo qual não são comparativas, </w:t>
       </w:r>
       <w:r>
         <w:rPr>
@@ -1882,7 +1954,33 @@
           <w:lang w:val="pt-BR"/>
         </w:rPr>
         <w:lastRenderedPageBreak/>
-        <w:t>Em 31 de agosto de 2025 a provisão segue a seguinte tabela de provisionamento:</w:t>
+        <w:t xml:space="preserve">Em </w:t>
+      </w:r>
+      <w:r>
+        <w:rPr>
+          <w:lang w:val="pt-BR"/>
+        </w:rPr>
+        <w:t>{{</w:t>
+      </w:r>
+      <w:proofErr w:type="spellStart"/>
+      <w:r>
+        <w:rPr>
+          <w:lang w:val="pt-BR"/>
+        </w:rPr>
+        <w:t>data_atual_extenso</w:t>
+      </w:r>
+      <w:proofErr w:type="spellEnd"/>
+      <w:r>
+        <w:rPr>
+          <w:lang w:val="pt-BR"/>
+        </w:rPr>
+        <w:t>}}</w:t>
+      </w:r>
+      <w:r>
+        <w:rPr>
+          <w:lang w:val="pt-BR"/>
+        </w:rPr>
+        <w:t xml:space="preserve"> a provisão segue a seguinte tabela de provisionamento:</w:t>
       </w:r>
     </w:p>
     <w:p>
@@ -3489,31 +3587,33 @@
         <w:rPr>
           <w:lang w:val="pt-BR"/>
         </w:rPr>
-        <w:t>A composição dos títulos e valores mobiliários em 3</w:t>
-      </w:r>
-      <w:r>
-        <w:rPr>
-          <w:lang w:val="pt-BR"/>
-        </w:rPr>
-        <w:t>1</w:t>
-      </w:r>
-      <w:r>
-        <w:rPr>
-          <w:lang w:val="pt-BR"/>
-        </w:rPr>
-        <w:t xml:space="preserve"> de </w:t>
-      </w:r>
-      <w:r>
-        <w:rPr>
-          <w:lang w:val="pt-BR"/>
-        </w:rPr>
-        <w:t>agosto</w:t>
-      </w:r>
-      <w:r>
-        <w:rPr>
-          <w:lang w:val="pt-BR"/>
-        </w:rPr>
-        <w:t xml:space="preserve"> de 2025 está assim apresentada:</w:t>
+        <w:t xml:space="preserve">A composição dos títulos e valores mobiliários em </w:t>
+      </w:r>
+      <w:r>
+        <w:rPr>
+          <w:lang w:val="pt-BR"/>
+        </w:rPr>
+        <w:t>{{</w:t>
+      </w:r>
+      <w:proofErr w:type="spellStart"/>
+      <w:r>
+        <w:rPr>
+          <w:lang w:val="pt-BR"/>
+        </w:rPr>
+        <w:t>data_atual_extenso</w:t>
+      </w:r>
+      <w:proofErr w:type="spellEnd"/>
+      <w:r>
+        <w:rPr>
+          <w:lang w:val="pt-BR"/>
+        </w:rPr>
+        <w:t>}}</w:t>
+      </w:r>
+      <w:r>
+        <w:rPr>
+          <w:lang w:val="pt-BR"/>
+        </w:rPr>
+        <w:t xml:space="preserve"> está assim apresentada:</w:t>
       </w:r>
     </w:p>
     <w:p>
@@ -3637,7 +3737,39 @@
                 <w:color w:val="000000"/>
                 <w:lang w:val="pt-BR" w:eastAsia="pt-BR"/>
               </w:rPr>
-              <w:t>Saldo em 31/08/2025</w:t>
+              <w:t xml:space="preserve">Saldo em </w:t>
+            </w:r>
+            <w:r>
+              <w:rPr>
+                <w:rFonts w:eastAsia="Times New Roman"/>
+                <w:b/>
+                <w:bCs/>
+                <w:color w:val="000000"/>
+                <w:lang w:val="pt-BR" w:eastAsia="pt-BR"/>
+              </w:rPr>
+              <w:t>{{</w:t>
+            </w:r>
+            <w:proofErr w:type="spellStart"/>
+            <w:r>
+              <w:rPr>
+                <w:rFonts w:eastAsia="Times New Roman"/>
+                <w:b/>
+                <w:bCs/>
+                <w:color w:val="000000"/>
+                <w:lang w:val="pt-BR" w:eastAsia="pt-BR"/>
+              </w:rPr>
+              <w:t>data_atual</w:t>
+            </w:r>
+            <w:proofErr w:type="spellEnd"/>
+            <w:r>
+              <w:rPr>
+                <w:rFonts w:eastAsia="Times New Roman"/>
+                <w:b/>
+                <w:bCs/>
+                <w:color w:val="000000"/>
+                <w:lang w:val="pt-BR" w:eastAsia="pt-BR"/>
+              </w:rPr>
+              <w:t>}}</w:t>
             </w:r>
           </w:p>
         </w:tc>
@@ -5668,7 +5800,6 @@
         <w:jc w:val="both"/>
       </w:pPr>
       <w:r>
-        <w:lastRenderedPageBreak/>
         <w:t>O fundo investido</w:t>
       </w:r>
       <w:r>
@@ -6105,7 +6236,14 @@
         <w:rPr>
           <w:highlight w:val="yellow"/>
         </w:rPr>
-        <w:t>Considerando que a Classe é destinada exclusivamente a investidores profissionais, a carteira da Classe não está sujeita a qualquer limite de concentração por Devedor, emissor e tipo de Direito Creditório, conforme facultado pelo art. 52, I, do Anexo Normativo II.</w:t>
+        <w:t xml:space="preserve">Considerando que a Classe é destinada exclusivamente a investidores profissionais, a carteira da Classe não está sujeita a qualquer limite de concentração por Devedor, emissor e tipo de Direito </w:t>
+      </w:r>
+      <w:r>
+        <w:rPr>
+          <w:highlight w:val="yellow"/>
+        </w:rPr>
+        <w:lastRenderedPageBreak/>
+        <w:t>Creditório, conforme facultado pelo art. 52, I, do Anexo Normativo II.</w:t>
       </w:r>
     </w:p>
     <w:p>
@@ -6120,7 +6258,6 @@
         <w:rPr>
           <w:highlight w:val="yellow"/>
         </w:rPr>
-        <w:lastRenderedPageBreak/>
         <w:t>A Classe poderá adquirir Direitos Creditórios caracterizados como não padronizados, nos termos do Anexo II da Resolução CVM 175.</w:t>
       </w:r>
     </w:p>
@@ -6414,11 +6551,11 @@
         <w:jc w:val="both"/>
       </w:pPr>
       <w:r>
-        <w:t xml:space="preserve">No caso da Classe deter significativa quantidade de Direitos Creditórios, o Custodiante, poderá efetuar trimestralmente, ou sempre que entender necessário ou conveniente, a verificação por amostragem do lastro dos Direitos Creditórios em conformidade com a metodologia descrita no </w:t>
+        <w:t xml:space="preserve">No caso da Classe deter significativa quantidade de Direitos Creditórios, o Custodiante, poderá efetuar trimestralmente, ou sempre que entender necessário ou conveniente, a verificação por </w:t>
       </w:r>
       <w:r>
         <w:lastRenderedPageBreak/>
-        <w:t>Anexo II, sendo certo que o Custodiante e/ou a empresa por ele contratada não analisará novamente os Direitos Creditórios transferidos cujo lastro já tenha sido verificado.</w:t>
+        <w:t>amostragem do lastro dos Direitos Creditórios em conformidade com a metodologia descrita no Anexo II, sendo certo que o Custodiante e/ou a empresa por ele contratada não analisará novamente os Direitos Creditórios transferidos cujo lastro já tenha sido verificado.</w:t>
       </w:r>
     </w:p>
     <w:p>
@@ -6528,7 +6665,53 @@
         <w:rPr>
           <w:lang w:val="pt-BR"/>
         </w:rPr>
-        <w:t>período de 10 de janeiro de 2025 (início das atividades) a 31 de agosto de 2025</w:t>
+        <w:t xml:space="preserve">período de </w:t>
+      </w:r>
+      <w:r>
+        <w:rPr>
+          <w:lang w:val="pt-BR"/>
+        </w:rPr>
+        <w:t>{{</w:t>
+      </w:r>
+      <w:proofErr w:type="spellStart"/>
+      <w:r>
+        <w:rPr>
+          <w:lang w:val="pt-BR"/>
+        </w:rPr>
+        <w:t>data_anterior_extenso</w:t>
+      </w:r>
+      <w:proofErr w:type="spellEnd"/>
+      <w:r>
+        <w:rPr>
+          <w:lang w:val="pt-BR"/>
+        </w:rPr>
+        <w:t>}}</w:t>
+      </w:r>
+      <w:r>
+        <w:rPr>
+          <w:lang w:val="pt-BR"/>
+        </w:rPr>
+        <w:t xml:space="preserve"> (início das atividades) a </w:t>
+      </w:r>
+      <w:r>
+        <w:rPr>
+          <w:lang w:val="pt-BR"/>
+        </w:rPr>
+        <w:t>{{</w:t>
+      </w:r>
+      <w:proofErr w:type="spellStart"/>
+      <w:r>
+        <w:rPr>
+          <w:lang w:val="pt-BR"/>
+        </w:rPr>
+        <w:t>data_atual_extenso</w:t>
+      </w:r>
+      <w:proofErr w:type="spellEnd"/>
+      <w:r>
+        <w:rPr>
+          <w:lang w:val="pt-BR"/>
+        </w:rPr>
+        <w:t>}}</w:t>
       </w:r>
       <w:r>
         <w:rPr>
@@ -6643,7 +6826,39 @@
                 <w:color w:val="000000"/>
                 <w:lang w:val="pt-BR" w:eastAsia="pt-BR"/>
               </w:rPr>
-              <w:t>Saldo em 10/01/2025</w:t>
+              <w:t xml:space="preserve">Saldo em </w:t>
+            </w:r>
+            <w:r>
+              <w:rPr>
+                <w:rFonts w:eastAsia="Times New Roman"/>
+                <w:b/>
+                <w:bCs/>
+                <w:color w:val="000000"/>
+                <w:lang w:val="pt-BR" w:eastAsia="pt-BR"/>
+              </w:rPr>
+              <w:t>{{</w:t>
+            </w:r>
+            <w:proofErr w:type="spellStart"/>
+            <w:r>
+              <w:rPr>
+                <w:rFonts w:eastAsia="Times New Roman"/>
+                <w:b/>
+                <w:bCs/>
+                <w:color w:val="000000"/>
+                <w:lang w:val="pt-BR" w:eastAsia="pt-BR"/>
+              </w:rPr>
+              <w:t>data_anterior</w:t>
+            </w:r>
+            <w:proofErr w:type="spellEnd"/>
+            <w:r>
+              <w:rPr>
+                <w:rFonts w:eastAsia="Times New Roman"/>
+                <w:b/>
+                <w:bCs/>
+                <w:color w:val="000000"/>
+                <w:lang w:val="pt-BR" w:eastAsia="pt-BR"/>
+              </w:rPr>
+              <w:t>}}</w:t>
             </w:r>
           </w:p>
         </w:tc>
@@ -6749,7 +6964,15 @@
                 <w:color w:val="000000"/>
                 <w:lang w:val="pt-BR" w:eastAsia="pt-BR"/>
               </w:rPr>
-              <w:t>(+) Aquisição de direitos creditórios</w:t>
+              <w:t xml:space="preserve">(+) Aquisição de </w:t>
+            </w:r>
+            <w:r>
+              <w:rPr>
+                <w:rFonts w:eastAsia="Times New Roman"/>
+                <w:color w:val="000000"/>
+                <w:lang w:val="pt-BR" w:eastAsia="pt-BR"/>
+              </w:rPr>
+              <w:t>s</w:t>
             </w:r>
           </w:p>
         </w:tc>
@@ -7022,7 +7245,39 @@
                 <w:color w:val="000000"/>
                 <w:lang w:val="pt-BR" w:eastAsia="pt-BR"/>
               </w:rPr>
-              <w:t>Saldo em 31/08/2025</w:t>
+              <w:t xml:space="preserve">Saldo em </w:t>
+            </w:r>
+            <w:r>
+              <w:rPr>
+                <w:rFonts w:eastAsia="Times New Roman"/>
+                <w:b/>
+                <w:bCs/>
+                <w:color w:val="000000"/>
+                <w:lang w:val="pt-BR" w:eastAsia="pt-BR"/>
+              </w:rPr>
+              <w:t>{{</w:t>
+            </w:r>
+            <w:proofErr w:type="spellStart"/>
+            <w:r>
+              <w:rPr>
+                <w:rFonts w:eastAsia="Times New Roman"/>
+                <w:b/>
+                <w:bCs/>
+                <w:color w:val="000000"/>
+                <w:lang w:val="pt-BR" w:eastAsia="pt-BR"/>
+              </w:rPr>
+              <w:t>data_atual</w:t>
+            </w:r>
+            <w:proofErr w:type="spellEnd"/>
+            <w:r>
+              <w:rPr>
+                <w:rFonts w:eastAsia="Times New Roman"/>
+                <w:b/>
+                <w:bCs/>
+                <w:color w:val="000000"/>
+                <w:lang w:val="pt-BR" w:eastAsia="pt-BR"/>
+              </w:rPr>
+              <w:t>}}</w:t>
             </w:r>
           </w:p>
         </w:tc>
@@ -7182,25 +7437,27 @@
         <w:rPr>
           <w:lang w:val="pt-BR"/>
         </w:rPr>
-        <w:t>3</w:t>
-      </w:r>
-      <w:r>
-        <w:rPr>
-          <w:lang w:val="pt-BR"/>
-        </w:rPr>
-        <w:t>1</w:t>
+        <w:t>{{</w:t>
+      </w:r>
+      <w:proofErr w:type="spellStart"/>
+      <w:r>
+        <w:rPr>
+          <w:lang w:val="pt-BR"/>
+        </w:rPr>
+        <w:t>data_atual_extenso</w:t>
+      </w:r>
+      <w:proofErr w:type="spellEnd"/>
+      <w:r>
+        <w:rPr>
+          <w:lang w:val="pt-BR"/>
+        </w:rPr>
+        <w:t>}}</w:t>
       </w:r>
       <w:r>
         <w:rPr>
           <w:lang w:val="pt-BR"/>
         </w:rPr>
         <w:t xml:space="preserve"> </w:t>
-      </w:r>
-      <w:r>
-        <w:rPr>
-          <w:lang w:val="pt-BR"/>
-        </w:rPr>
-        <w:t xml:space="preserve">de agosto de 2025 </w:t>
       </w:r>
       <w:r>
         <w:rPr>
@@ -7424,7 +7681,39 @@
                 <w:color w:val="000000"/>
                 <w:lang w:val="pt-BR" w:eastAsia="pt-BR"/>
               </w:rPr>
-              <w:t>Saldo em 31/08/2025</w:t>
+              <w:t xml:space="preserve">Saldo em </w:t>
+            </w:r>
+            <w:r>
+              <w:rPr>
+                <w:rFonts w:eastAsia="Times New Roman"/>
+                <w:b/>
+                <w:bCs/>
+                <w:color w:val="000000"/>
+                <w:lang w:val="pt-BR" w:eastAsia="pt-BR"/>
+              </w:rPr>
+              <w:t>{{</w:t>
+            </w:r>
+            <w:proofErr w:type="spellStart"/>
+            <w:r>
+              <w:rPr>
+                <w:rFonts w:eastAsia="Times New Roman"/>
+                <w:b/>
+                <w:bCs/>
+                <w:color w:val="000000"/>
+                <w:lang w:val="pt-BR" w:eastAsia="pt-BR"/>
+              </w:rPr>
+              <w:t>data_atual</w:t>
+            </w:r>
+            <w:proofErr w:type="spellEnd"/>
+            <w:r>
+              <w:rPr>
+                <w:rFonts w:eastAsia="Times New Roman"/>
+                <w:b/>
+                <w:bCs/>
+                <w:color w:val="000000"/>
+                <w:lang w:val="pt-BR" w:eastAsia="pt-BR"/>
+              </w:rPr>
+              <w:t>}}</w:t>
             </w:r>
           </w:p>
         </w:tc>
@@ -8560,7 +8849,6 @@
           <w:highlight w:val="yellow"/>
           <w:lang w:val="pt-BR"/>
         </w:rPr>
-        <w:lastRenderedPageBreak/>
         <w:t xml:space="preserve">Concentração dos maiores devedores </w:t>
       </w:r>
     </w:p>
@@ -8591,7 +8879,33 @@
         <w:rPr>
           <w:lang w:val="pt-BR"/>
         </w:rPr>
-        <w:t>A concentração dos maiores devedores em 31 de agosto de 2025 está assim apresentada:</w:t>
+        <w:t xml:space="preserve">A concentração dos maiores devedores em </w:t>
+      </w:r>
+      <w:r>
+        <w:rPr>
+          <w:lang w:val="pt-BR"/>
+        </w:rPr>
+        <w:t>{{</w:t>
+      </w:r>
+      <w:proofErr w:type="spellStart"/>
+      <w:r>
+        <w:rPr>
+          <w:lang w:val="pt-BR"/>
+        </w:rPr>
+        <w:t>data_atual_extenso</w:t>
+      </w:r>
+      <w:proofErr w:type="spellEnd"/>
+      <w:r>
+        <w:rPr>
+          <w:lang w:val="pt-BR"/>
+        </w:rPr>
+        <w:t>}}</w:t>
+      </w:r>
+      <w:r>
+        <w:rPr>
+          <w:lang w:val="pt-BR"/>
+        </w:rPr>
+        <w:t xml:space="preserve"> está assim apresentada:</w:t>
       </w:r>
     </w:p>
     <w:p>
@@ -8663,7 +8977,39 @@
                 <w:color w:val="000000"/>
                 <w:lang w:val="pt-BR" w:eastAsia="pt-BR"/>
               </w:rPr>
-              <w:t>Maiores devedores dos direitos creditórios - 31/08/2025</w:t>
+              <w:t xml:space="preserve">Maiores devedores dos direitos creditórios - </w:t>
+            </w:r>
+            <w:r>
+              <w:rPr>
+                <w:rFonts w:eastAsia="Times New Roman"/>
+                <w:b/>
+                <w:bCs/>
+                <w:color w:val="000000"/>
+                <w:lang w:val="pt-BR" w:eastAsia="pt-BR"/>
+              </w:rPr>
+              <w:t>{{</w:t>
+            </w:r>
+            <w:proofErr w:type="spellStart"/>
+            <w:r>
+              <w:rPr>
+                <w:rFonts w:eastAsia="Times New Roman"/>
+                <w:b/>
+                <w:bCs/>
+                <w:color w:val="000000"/>
+                <w:lang w:val="pt-BR" w:eastAsia="pt-BR"/>
+              </w:rPr>
+              <w:t>data_atual</w:t>
+            </w:r>
+            <w:proofErr w:type="spellEnd"/>
+            <w:r>
+              <w:rPr>
+                <w:rFonts w:eastAsia="Times New Roman"/>
+                <w:b/>
+                <w:bCs/>
+                <w:color w:val="000000"/>
+                <w:lang w:val="pt-BR" w:eastAsia="pt-BR"/>
+              </w:rPr>
+              <w:t>}}</w:t>
             </w:r>
           </w:p>
         </w:tc>
@@ -9673,17 +10019,17 @@
         <w:tblLook w:val="04A0" w:firstRow="1" w:lastRow="0" w:firstColumn="1" w:lastColumn="0" w:noHBand="0" w:noVBand="1"/>
       </w:tblPr>
       <w:tblGrid>
-        <w:gridCol w:w="1797"/>
-        <w:gridCol w:w="152"/>
-        <w:gridCol w:w="974"/>
-        <w:gridCol w:w="152"/>
-        <w:gridCol w:w="1008"/>
-        <w:gridCol w:w="152"/>
-        <w:gridCol w:w="787"/>
-        <w:gridCol w:w="152"/>
-        <w:gridCol w:w="774"/>
-        <w:gridCol w:w="152"/>
-        <w:gridCol w:w="1116"/>
+        <w:gridCol w:w="1850"/>
+        <w:gridCol w:w="156"/>
+        <w:gridCol w:w="1002"/>
+        <w:gridCol w:w="156"/>
+        <w:gridCol w:w="1037"/>
+        <w:gridCol w:w="156"/>
+        <w:gridCol w:w="809"/>
+        <w:gridCol w:w="156"/>
+        <w:gridCol w:w="797"/>
+        <w:gridCol w:w="156"/>
+        <w:gridCol w:w="1148"/>
       </w:tblGrid>
       <w:tr>
         <w:trPr>
@@ -9725,7 +10071,39 @@
                 <w:color w:val="000000"/>
                 <w:lang w:val="pt-BR" w:eastAsia="pt-BR"/>
               </w:rPr>
-              <w:t>Provisão para perda no valor recuperável de direitos creditórios - 31/08/2025</w:t>
+              <w:t xml:space="preserve">Provisão para perda no valor recuperável de direitos creditórios - </w:t>
+            </w:r>
+            <w:r>
+              <w:rPr>
+                <w:rFonts w:eastAsia="Times New Roman"/>
+                <w:b/>
+                <w:bCs/>
+                <w:color w:val="000000"/>
+                <w:lang w:val="pt-BR" w:eastAsia="pt-BR"/>
+              </w:rPr>
+              <w:t>{{</w:t>
+            </w:r>
+            <w:proofErr w:type="spellStart"/>
+            <w:r>
+              <w:rPr>
+                <w:rFonts w:eastAsia="Times New Roman"/>
+                <w:b/>
+                <w:bCs/>
+                <w:color w:val="000000"/>
+                <w:lang w:val="pt-BR" w:eastAsia="pt-BR"/>
+              </w:rPr>
+              <w:t>data_atual</w:t>
+            </w:r>
+            <w:proofErr w:type="spellEnd"/>
+            <w:r>
+              <w:rPr>
+                <w:rFonts w:eastAsia="Times New Roman"/>
+                <w:b/>
+                <w:bCs/>
+                <w:color w:val="000000"/>
+                <w:lang w:val="pt-BR" w:eastAsia="pt-BR"/>
+              </w:rPr>
+              <w:t>}}</w:t>
             </w:r>
           </w:p>
         </w:tc>
@@ -11057,7 +11435,59 @@
         <w:rPr>
           <w:lang w:val="pt-BR"/>
         </w:rPr>
-        <w:t xml:space="preserve">No período de 10 de janeiro de 2025 (início das atividades) a 31 de agosto de 2025 </w:t>
+        <w:t xml:space="preserve">No período de </w:t>
+      </w:r>
+      <w:r>
+        <w:rPr>
+          <w:lang w:val="pt-BR"/>
+        </w:rPr>
+        <w:t>{{</w:t>
+      </w:r>
+      <w:proofErr w:type="spellStart"/>
+      <w:r>
+        <w:rPr>
+          <w:lang w:val="pt-BR"/>
+        </w:rPr>
+        <w:t>data_anterior_extenso</w:t>
+      </w:r>
+      <w:proofErr w:type="spellEnd"/>
+      <w:r>
+        <w:rPr>
+          <w:lang w:val="pt-BR"/>
+        </w:rPr>
+        <w:t>}}</w:t>
+      </w:r>
+      <w:r>
+        <w:rPr>
+          <w:lang w:val="pt-BR"/>
+        </w:rPr>
+        <w:t xml:space="preserve"> (início das atividades) a </w:t>
+      </w:r>
+      <w:r>
+        <w:rPr>
+          <w:lang w:val="pt-BR"/>
+        </w:rPr>
+        <w:t>{{</w:t>
+      </w:r>
+      <w:proofErr w:type="spellStart"/>
+      <w:r>
+        <w:rPr>
+          <w:lang w:val="pt-BR"/>
+        </w:rPr>
+        <w:t>data_atual_extenso</w:t>
+      </w:r>
+      <w:proofErr w:type="spellEnd"/>
+      <w:r>
+        <w:rPr>
+          <w:lang w:val="pt-BR"/>
+        </w:rPr>
+        <w:t>}}</w:t>
+      </w:r>
+      <w:r>
+        <w:rPr>
+          <w:lang w:val="pt-BR"/>
+        </w:rPr>
+        <w:t xml:space="preserve"> </w:t>
       </w:r>
       <w:r>
         <w:rPr>
@@ -11178,14 +11608,11 @@
           <w:b/>
           <w:bCs/>
         </w:rPr>
+        <w:lastRenderedPageBreak/>
         <w:t>Descasamento de Rentabilidade:</w:t>
       </w:r>
       <w:r>
-        <w:t xml:space="preserve"> A distribuição dos rendimentos da carteira da Classe para as </w:t>
-      </w:r>
-      <w:r>
-        <w:lastRenderedPageBreak/>
-        <w:t>Cotas pode ter parâmetros diferentes daqueles utilizados para o preço de aquisição dos Direitos Creditórios. Não obstante quaisquer medidas adotadas, os recursos da Classe pode</w:t>
+        <w:t xml:space="preserve"> A distribuição dos rendimentos da carteira da Classe para as Cotas pode ter parâmetros diferentes daqueles utilizados para o preço de aquisição dos Direitos Creditórios. Não obstante quaisquer medidas adotadas, os recursos da Classe pode</w:t>
       </w:r>
       <w:r>
         <w:t>m</w:t>
@@ -11321,7 +11748,6 @@
           <w:b/>
           <w:bCs/>
         </w:rPr>
-        <w:lastRenderedPageBreak/>
         <w:t>Cobrança Judicial e Extrajudicial:</w:t>
       </w:r>
       <w:r>
@@ -11430,11 +11856,11 @@
         <w:t>Falta de Liquidez no Mercado Secundário para Fundos de Investimento em Direitos Creditórios:</w:t>
       </w:r>
       <w:r>
-        <w:t xml:space="preserve"> Os fundos de investimento em direitos creditórios são um sofisticado tipo de investimento no mercado financeiro brasileiro e, por essa razão, possuem aplicação restrita a pessoas físicas ou jurídicas que se classifiquem como Investidores Profissionais. Considerando-se isso, os investidores podem preferir formas de investimentos mais tradicionais. Além disso, fundos de investimento em direitos creditórios, como o Fundo, têm baixa liquidez no mercado secundário brasileiro, portanto os Cotistas podem ter dificuldade em vender suas Cotas no </w:t>
+        <w:t xml:space="preserve"> Os fundos de investimento em direitos creditórios são um sofisticado tipo de investimento no mercado financeiro brasileiro e, por essa razão, possuem aplicação restrita a pessoas físicas ou jurídicas que se classifiquem como Investidores Profissionais. Considerando-se isso, os investidores podem preferir formas de investimentos mais tradicionais. Além disso, fundos de investimento em direitos creditórios, como o Fundo, têm baixa liquidez no mercado </w:t>
       </w:r>
       <w:r>
         <w:lastRenderedPageBreak/>
-        <w:t>mercado secundário;</w:t>
+        <w:t>secundário brasileiro, portanto os Cotistas podem ter dificuldade em vender suas Cotas no mercado secundário;</w:t>
       </w:r>
     </w:p>
     <w:p>
@@ -11573,7 +11999,11 @@
         <w:t>Observância da Alocação Mínima:</w:t>
       </w:r>
       <w:r>
-        <w:t xml:space="preserve"> A Classe deve adquirir preponderantemente Direitos Creditórios. Entretanto, não há garantia de que os Cedentes ou Endossantes conseguirão originar e ceder ou endossar Direitos Creditórios suficientes para fazer frente à Alocação Mínima. A existência da Classe no tempo dependerá da manutenção dos fluxos de originação e de transferência de Direitos Creditórios; e</w:t>
+        <w:t xml:space="preserve"> A Classe deve adquirir preponderantemente Direitos Creditórios. Entretanto, não há garantia de que os Cedentes ou Endossantes conseguirão originar e ceder ou endossar Direitos Creditórios suficientes para fazer frente à Alocação Mínima. A existência da Classe no tempo dependerá da manutenção dos fluxos de originação e </w:t>
+      </w:r>
+      <w:r>
+        <w:lastRenderedPageBreak/>
+        <w:t>de transferência de Direitos Creditórios; e</w:t>
       </w:r>
     </w:p>
     <w:p>
@@ -11586,7 +12016,6 @@
           <w:b/>
           <w:bCs/>
         </w:rPr>
-        <w:lastRenderedPageBreak/>
         <w:t>Interrupção dos Serviços pelos Prestadores Contratados pela Classe:</w:t>
       </w:r>
       <w:r>
@@ -11757,17 +12186,17 @@
         <w:t>Alterações Fora do Controle da Administradora:</w:t>
       </w:r>
       <w:r>
-        <w:t xml:space="preserve"> A Classe também poderá estar sujeito a outros riscos advindos de motivos alheios ou exógenos ao controle da Administradora, tais como moratória, inadimplemento de pagamentos, mudança nas regras aplicáveis aos Ativos Financeiros, mudanças impostas aos Ativos Financeiros integrantes da carteira, alteração na política monetária, aplicações ou resgates</w:t>
+        <w:t xml:space="preserve"> A Classe também poderá estar sujeito a outros riscos advindos de motivos alheios ou exógenos ao controle da Administradora, tais como moratória, inadimplemento de pagamentos, mudança nas regras aplicáveis aos Ativos Financeiros, mudanças impostas aos Ativos Financeiros integrantes da carteira, alteração na </w:t>
+      </w:r>
+      <w:r>
+        <w:lastRenderedPageBreak/>
+        <w:t>política monetária, aplicações ou resgates</w:t>
       </w:r>
       <w:r>
         <w:t xml:space="preserve"> </w:t>
       </w:r>
       <w:r>
-        <w:t xml:space="preserve">significativos de tais ativos, podendo gerar perdas ao </w:t>
-      </w:r>
-      <w:r>
-        <w:lastRenderedPageBreak/>
-        <w:t>Fundo e, consequentemente, aos Cotistas;</w:t>
+        <w:t>significativos de tais ativos, podendo gerar perdas ao Fundo e, consequentemente, aos Cotistas;</w:t>
       </w:r>
     </w:p>
     <w:p>
@@ -11889,17 +12318,17 @@
         <w:t>Invalidade ou Ineficácia do Endosso de Direitos Creditórios:</w:t>
       </w:r>
       <w:r>
-        <w:t xml:space="preserve"> O endosso das CCBs pode ser invalidado ou tornar-se ineficaz por decisão judicial e/ou administrativa. Assim, a Classe poderá incorrer no risco de os Direitos Creditórios serem alcançados por obrigações assumidas pelos Endossantes e/ou pelo Devedor, os recursos decorrentes de seus pagamentos serem bloqueados e/ou redirecionados para pagamentos de outras dívidas por obrigações dos Endossantes e/ou do Devedor, inclusive em decorrência de pedidos de intervenção, recuperação judicial, recuperação extrajudicial, falência, liquidação extrajudicial ou regimes especiais, conforme o caso, dos Endossantes e/ou do Devedor, ou em outro procedimento de natureza similar, conforme aplicável. A Administradora, a Gestora ou Custodiante não são responsáveis pela verificação prévia ou posterior de determinadas causas de invalidade ou ineficácia do endosso dos Direitos Creditórios transferidos à Classe. Com relação aos Endossantes, o endosso das CCBs e a transferência dos Direitos Creditórios poderia ser invalidado ou</w:t>
+        <w:t xml:space="preserve"> O endosso das CCBs pode ser invalidado ou tornar-se ineficaz por decisão judicial e/ou administrativa. Assim, a Classe poderá incorrer no risco de os Direitos Creditórios serem alcançados por obrigações assumidas pelos Endossantes e/ou pelo Devedor, os recursos decorrentes de seus pagamentos serem bloqueados e/ou redirecionados para pagamentos de outras dívidas por obrigações dos Endossantes e/ou do Devedor, inclusive em decorrência de pedidos de intervenção, recuperação judicial, recuperação extrajudicial, falência, liquidação extrajudicial ou regimes especiais, conforme o caso, dos Endossantes e/ou do Devedor, ou em outro procedimento de natureza similar, conforme aplicável. A Administradora, a Gestora ou Custodiante não são responsáveis pela verificação prévia ou posterior de determinadas causas de invalidade ou ineficácia do endosso dos Direitos Creditórios transferidos à Classe. Com relação aos Endossantes, o endosso das CCBs e a transferência dos Direitos Creditórios poderia ser </w:t>
+      </w:r>
+      <w:r>
+        <w:lastRenderedPageBreak/>
+        <w:t>invalidado ou</w:t>
       </w:r>
       <w:r>
         <w:t xml:space="preserve"> </w:t>
       </w:r>
       <w:r>
-        <w:t xml:space="preserve">declarado ineficaz, impactando negativamente o patrimônio do Fundo, caso fosse </w:t>
-      </w:r>
-      <w:r>
-        <w:lastRenderedPageBreak/>
-        <w:t>realizada em:</w:t>
+        <w:t>declarado ineficaz, impactando negativamente o patrimônio do Fundo, caso fosse realizada em:</w:t>
       </w:r>
     </w:p>
     <w:p>
@@ -12047,11 +12476,11 @@
         <w:t xml:space="preserve">a </w:t>
       </w:r>
       <w:r>
-        <w:t xml:space="preserve">Classe não são uma instituição financeira e, portanto, não tem autorização para conceder empréstimos ou </w:t>
+        <w:t xml:space="preserve">Classe não são uma </w:t>
       </w:r>
       <w:r>
         <w:lastRenderedPageBreak/>
-        <w:t>financiamentos cujos juros estejam acima do estabelecido pelo Decreto nº 22.626, de 7 de abril de 1933. É possível que o preço do deságio aplicado pelo Fundo e/ou pela Classe para aquisição de Direitos Creditórios seja questionado pelo fato de o Fundo não ser instituição financeira, caso tal deságio seja superior ao máximo estabelecido pelo Decreto nº 22.626, de 7 de abril de 1933. Caso o referido deságio seja questionado e/ou limitado por decisão judicial, a rentabilidade das Cotas poderia ser afetada negativamente; e</w:t>
+        <w:t>instituição financeira e, portanto, não tem autorização para conceder empréstimos ou financiamentos cujos juros estejam acima do estabelecido pelo Decreto nº 22.626, de 7 de abril de 1933. É possível que o preço do deságio aplicado pelo Fundo e/ou pela Classe para aquisição de Direitos Creditórios seja questionado pelo fato de o Fundo não ser instituição financeira, caso tal deságio seja superior ao máximo estabelecido pelo Decreto nº 22.626, de 7 de abril de 1933. Caso o referido deságio seja questionado e/ou limitado por decisão judicial, a rentabilidade das Cotas poderia ser afetada negativamente; e</w:t>
       </w:r>
     </w:p>
     <w:p>
@@ -12315,11 +12744,11 @@
         <w:jc w:val="both"/>
       </w:pPr>
       <w:r>
-        <w:t xml:space="preserve">As Cotas Seniores poderão ser divididas em séries com valores e prazos diferenciados para amortização, resgate e remuneração, sendo que cada série terá as mesmas características e </w:t>
+        <w:t xml:space="preserve">As Cotas Seniores poderão ser divididas em séries com valores e prazos diferenciados para </w:t>
       </w:r>
       <w:r>
         <w:lastRenderedPageBreak/>
-        <w:t>conferirá a seus titulares iguais direitos e obrigações nos termos d</w:t>
+        <w:t>amortização, resgate e remuneração, sendo que cada série terá as mesmas características e conferirá a seus titulares iguais direitos e obrigações nos termos d</w:t>
       </w:r>
       <w:r>
         <w:t>o</w:t>
@@ -12547,7 +12976,11 @@
         <w:t>é</w:t>
       </w:r>
       <w:r>
-        <w:t xml:space="preserve"> efetivada mediante a celebração de Boletim de Subscrição, assinado pelo subscritor e autenticado pela Administradora.</w:t>
+        <w:t xml:space="preserve"> efetivada mediante a celebração de Boletim de Subscrição, </w:t>
+      </w:r>
+      <w:r>
+        <w:lastRenderedPageBreak/>
+        <w:t>assinado pelo subscritor e autenticado pela Administradora.</w:t>
       </w:r>
     </w:p>
     <w:p>
@@ -12556,7 +12989,6 @@
         <w:jc w:val="both"/>
       </w:pPr>
       <w:r>
-        <w:lastRenderedPageBreak/>
         <w:t>A qualidade de Cotista da Classe caracterizar-se-á (i) pela validação da Administradora de toda a documentação cadastral do Cotista, incluindo o termo de adesão devidamente assinado e (ii) pela abertura de conta de depósitos em nome do Cotista.</w:t>
       </w:r>
     </w:p>
@@ -12816,17 +13248,14 @@
         <w:jc w:val="both"/>
       </w:pPr>
       <w:r>
+        <w:lastRenderedPageBreak/>
         <w:t>terceiro, todos os valores remanescentes s</w:t>
       </w:r>
       <w:r>
         <w:t>ão</w:t>
       </w:r>
       <w:r>
-        <w:t xml:space="preserve"> distribuídos aos Cotistas Seniores, até o </w:t>
-      </w:r>
-      <w:r>
-        <w:lastRenderedPageBreak/>
-        <w:t>Benchmark Sênior; e</w:t>
+        <w:t xml:space="preserve"> distribuídos aos Cotistas Seniores, até o Benchmark Sênior; e</w:t>
       </w:r>
     </w:p>
     <w:p>
@@ -13164,7 +13593,59 @@
         <w:rPr>
           <w:lang w:val="pt-BR"/>
         </w:rPr>
-        <w:t>No período de 10 de janeiro de 2025 (início das atividades) a 31 de agosto de 2025 foram emitidas 42.297,037680 cotas da única subclasse do Fundo, correspondentes ao montante de R$ 42.297.</w:t>
+        <w:t xml:space="preserve">No período de </w:t>
+      </w:r>
+      <w:r>
+        <w:rPr>
+          <w:lang w:val="pt-BR"/>
+        </w:rPr>
+        <w:t>{{</w:t>
+      </w:r>
+      <w:proofErr w:type="spellStart"/>
+      <w:r>
+        <w:rPr>
+          <w:lang w:val="pt-BR"/>
+        </w:rPr>
+        <w:t>data_anterior_extenso</w:t>
+      </w:r>
+      <w:proofErr w:type="spellEnd"/>
+      <w:r>
+        <w:rPr>
+          <w:lang w:val="pt-BR"/>
+        </w:rPr>
+        <w:t>}}</w:t>
+      </w:r>
+      <w:r>
+        <w:rPr>
+          <w:lang w:val="pt-BR"/>
+        </w:rPr>
+        <w:t xml:space="preserve"> (início das atividades) a </w:t>
+      </w:r>
+      <w:r>
+        <w:rPr>
+          <w:lang w:val="pt-BR"/>
+        </w:rPr>
+        <w:t>{{</w:t>
+      </w:r>
+      <w:proofErr w:type="spellStart"/>
+      <w:r>
+        <w:rPr>
+          <w:lang w:val="pt-BR"/>
+        </w:rPr>
+        <w:t>data_atual_extenso</w:t>
+      </w:r>
+      <w:proofErr w:type="spellEnd"/>
+      <w:r>
+        <w:rPr>
+          <w:lang w:val="pt-BR"/>
+        </w:rPr>
+        <w:t>}}</w:t>
+      </w:r>
+      <w:r>
+        <w:rPr>
+          <w:lang w:val="pt-BR"/>
+        </w:rPr>
+        <w:t xml:space="preserve"> foram emitidas 42.297,037680 cotas da única subclasse do Fundo, correspondentes ao montante de R$ 42.297.</w:t>
       </w:r>
     </w:p>
     <w:p>
@@ -13195,7 +13676,6 @@
           <w:bCs/>
           <w:highlight w:val="yellow"/>
         </w:rPr>
-        <w:lastRenderedPageBreak/>
         <w:t>Prestadores de serviços</w:t>
       </w:r>
       <w:r>
@@ -13920,7 +14400,67 @@
                 <w:color w:val="000000"/>
                 <w:lang w:val="pt-BR" w:eastAsia="pt-BR"/>
               </w:rPr>
-              <w:t>Período de 10/01/2025 a 31/08/2025</w:t>
+              <w:t xml:space="preserve">Período de </w:t>
+            </w:r>
+            <w:r>
+              <w:rPr>
+                <w:rFonts w:eastAsia="Times New Roman"/>
+                <w:color w:val="000000"/>
+                <w:lang w:val="pt-BR" w:eastAsia="pt-BR"/>
+              </w:rPr>
+              <w:t>{{</w:t>
+            </w:r>
+            <w:proofErr w:type="spellStart"/>
+            <w:r>
+              <w:rPr>
+                <w:rFonts w:eastAsia="Times New Roman"/>
+                <w:color w:val="000000"/>
+                <w:lang w:val="pt-BR" w:eastAsia="pt-BR"/>
+              </w:rPr>
+              <w:t>data_anterior</w:t>
+            </w:r>
+            <w:proofErr w:type="spellEnd"/>
+            <w:r>
+              <w:rPr>
+                <w:rFonts w:eastAsia="Times New Roman"/>
+                <w:color w:val="000000"/>
+                <w:lang w:val="pt-BR" w:eastAsia="pt-BR"/>
+              </w:rPr>
+              <w:t>}}</w:t>
+            </w:r>
+            <w:r>
+              <w:rPr>
+                <w:rFonts w:eastAsia="Times New Roman"/>
+                <w:color w:val="000000"/>
+                <w:lang w:val="pt-BR" w:eastAsia="pt-BR"/>
+              </w:rPr>
+              <w:t xml:space="preserve"> a </w:t>
+            </w:r>
+            <w:r>
+              <w:rPr>
+                <w:rFonts w:eastAsia="Times New Roman"/>
+                <w:color w:val="000000"/>
+                <w:lang w:val="pt-BR" w:eastAsia="pt-BR"/>
+              </w:rPr>
+              <w:t>{{</w:t>
+            </w:r>
+            <w:proofErr w:type="spellStart"/>
+            <w:r>
+              <w:rPr>
+                <w:rFonts w:eastAsia="Times New Roman"/>
+                <w:color w:val="000000"/>
+                <w:lang w:val="pt-BR" w:eastAsia="pt-BR"/>
+              </w:rPr>
+              <w:t>data_atual</w:t>
+            </w:r>
+            <w:proofErr w:type="spellEnd"/>
+            <w:r>
+              <w:rPr>
+                <w:rFonts w:eastAsia="Times New Roman"/>
+                <w:color w:val="000000"/>
+                <w:lang w:val="pt-BR" w:eastAsia="pt-BR"/>
+              </w:rPr>
+              <w:t>}}</w:t>
             </w:r>
           </w:p>
         </w:tc>
@@ -14113,7 +14653,41 @@
                 <w:color w:val="000000"/>
                 <w:lang w:val="pt-BR" w:eastAsia="pt-BR"/>
               </w:rPr>
-              <w:t>Em 10/01/2025 (i)</w:t>
+              <w:t xml:space="preserve">Em </w:t>
+            </w:r>
+            <w:r>
+              <w:rPr>
+                <w:rFonts w:eastAsia="Times New Roman"/>
+                <w:color w:val="000000"/>
+                <w:lang w:val="pt-BR" w:eastAsia="pt-BR"/>
+              </w:rPr>
+              <w:t>{{</w:t>
+            </w:r>
+            <w:proofErr w:type="spellStart"/>
+            <w:r>
+              <w:rPr>
+                <w:rFonts w:eastAsia="Times New Roman"/>
+                <w:color w:val="000000"/>
+                <w:lang w:val="pt-BR" w:eastAsia="pt-BR"/>
+              </w:rPr>
+              <w:t>data_anterior</w:t>
+            </w:r>
+            <w:proofErr w:type="spellEnd"/>
+            <w:r>
+              <w:rPr>
+                <w:rFonts w:eastAsia="Times New Roman"/>
+                <w:color w:val="000000"/>
+                <w:lang w:val="pt-BR" w:eastAsia="pt-BR"/>
+              </w:rPr>
+              <w:t>}}</w:t>
+            </w:r>
+            <w:r>
+              <w:rPr>
+                <w:rFonts w:eastAsia="Times New Roman"/>
+                <w:color w:val="000000"/>
+                <w:lang w:val="pt-BR" w:eastAsia="pt-BR"/>
+              </w:rPr>
+              <w:t xml:space="preserve"> (i)</w:t>
             </w:r>
           </w:p>
         </w:tc>
@@ -14507,11 +15081,8 @@
         <w:jc w:val="both"/>
       </w:pPr>
       <w:r>
-        <w:t xml:space="preserve">A Administradora pode estabelecer que parcelas da Taxa de Administração sejam pagas, pelo Fundo, diretamente aos prestadores de serviço por ela contratados em nome do Fundo, desde </w:t>
-      </w:r>
-      <w:r>
         <w:lastRenderedPageBreak/>
-        <w:t>que o somatório dessas parcelas não exceda o montante total da referida taxa.</w:t>
+        <w:t>A Administradora pode estabelecer que parcelas da Taxa de Administração sejam pagas, pelo Fundo, diretamente aos prestadores de serviço por ela contratados em nome do Fundo, desde que o somatório dessas parcelas não exceda o montante total da referida taxa.</w:t>
       </w:r>
     </w:p>
     <w:p>
@@ -14694,7 +15265,19 @@
         <w:t>As despesas apropriadas no</w:t>
       </w:r>
       <w:r>
-        <w:t xml:space="preserve"> período de 10 de janeiro de 2025 (início das atividades) a 31 de agosto de 2025, </w:t>
+        <w:t xml:space="preserve"> período de </w:t>
+      </w:r>
+      <w:r>
+        <w:t>{{data_anterior_extenso}}</w:t>
+      </w:r>
+      <w:r>
+        <w:t xml:space="preserve"> (início das atividades) a </w:t>
+      </w:r>
+      <w:r>
+        <w:t>{{data_atual_extenso}}</w:t>
+      </w:r>
+      <w:r>
+        <w:t xml:space="preserve">, </w:t>
       </w:r>
       <w:r>
         <w:t>estão assim apresentadas:</w:t>
@@ -14718,7 +15301,7 @@
       <w:tblGrid>
         <w:gridCol w:w="2148"/>
         <w:gridCol w:w="146"/>
-        <w:gridCol w:w="1380"/>
+        <w:gridCol w:w="1706"/>
       </w:tblGrid>
       <w:tr>
         <w:trPr>
@@ -14911,7 +15494,29 @@
                 <w:color w:val="000000"/>
                 <w:lang w:val="pt-BR" w:eastAsia="pt-BR"/>
               </w:rPr>
-              <w:t>10/01/2025</w:t>
+              <w:t>{{</w:t>
+            </w:r>
+            <w:proofErr w:type="spellStart"/>
+            <w:r>
+              <w:rPr>
+                <w:rFonts w:eastAsia="Times New Roman"/>
+                <w:b/>
+                <w:bCs/>
+                <w:color w:val="000000"/>
+                <w:lang w:val="pt-BR" w:eastAsia="pt-BR"/>
+              </w:rPr>
+              <w:t>data_anterior</w:t>
+            </w:r>
+            <w:proofErr w:type="spellEnd"/>
+            <w:r>
+              <w:rPr>
+                <w:rFonts w:eastAsia="Times New Roman"/>
+                <w:b/>
+                <w:bCs/>
+                <w:color w:val="000000"/>
+                <w:lang w:val="pt-BR" w:eastAsia="pt-BR"/>
+              </w:rPr>
+              <w:t>}}</w:t>
             </w:r>
           </w:p>
         </w:tc>
@@ -15021,7 +15626,39 @@
                 <w:color w:val="000000"/>
                 <w:lang w:val="pt-BR" w:eastAsia="pt-BR"/>
               </w:rPr>
-              <w:t>a 31/08/2025</w:t>
+              <w:t xml:space="preserve">a </w:t>
+            </w:r>
+            <w:r>
+              <w:rPr>
+                <w:rFonts w:eastAsia="Times New Roman"/>
+                <w:b/>
+                <w:bCs/>
+                <w:color w:val="000000"/>
+                <w:lang w:val="pt-BR" w:eastAsia="pt-BR"/>
+              </w:rPr>
+              <w:t>{{</w:t>
+            </w:r>
+            <w:proofErr w:type="spellStart"/>
+            <w:r>
+              <w:rPr>
+                <w:rFonts w:eastAsia="Times New Roman"/>
+                <w:b/>
+                <w:bCs/>
+                <w:color w:val="000000"/>
+                <w:lang w:val="pt-BR" w:eastAsia="pt-BR"/>
+              </w:rPr>
+              <w:t>data_atual</w:t>
+            </w:r>
+            <w:proofErr w:type="spellEnd"/>
+            <w:r>
+              <w:rPr>
+                <w:rFonts w:eastAsia="Times New Roman"/>
+                <w:b/>
+                <w:bCs/>
+                <w:color w:val="000000"/>
+                <w:lang w:val="pt-BR" w:eastAsia="pt-BR"/>
+              </w:rPr>
+              <w:t>}}</w:t>
             </w:r>
           </w:p>
         </w:tc>
@@ -15292,6 +15929,7 @@
           <w:highlight w:val="yellow"/>
           <w:lang w:val="pt-BR"/>
         </w:rPr>
+        <w:lastRenderedPageBreak/>
         <w:t>Todos os resultados auferidos pelo Fundo s</w:t>
       </w:r>
       <w:r>
@@ -15306,15 +15944,7 @@
           <w:highlight w:val="yellow"/>
           <w:lang w:val="pt-BR"/>
         </w:rPr>
-        <w:t xml:space="preserve"> incorporados ao seu patrimônio, de maneira diferenciada para cada serie ou classe de cotas conforme as regras estabelecidas no </w:t>
-      </w:r>
-      <w:r>
-        <w:rPr>
-          <w:highlight w:val="yellow"/>
-          <w:lang w:val="pt-BR"/>
-        </w:rPr>
-        <w:lastRenderedPageBreak/>
-        <w:t>Regulamento.</w:t>
+        <w:t xml:space="preserve"> incorporados ao seu patrimônio, de maneira diferenciada para cada serie ou classe de cotas conforme as regras estabelecidas no Regulamento.</w:t>
       </w:r>
       <w:r>
         <w:rPr>
@@ -15926,6 +16556,7 @@
           <w:highlight w:val="yellow"/>
           <w:lang w:val="pt-BR"/>
         </w:rPr>
+        <w:lastRenderedPageBreak/>
         <w:t xml:space="preserve"> </w:t>
       </w:r>
     </w:p>
@@ -15959,15 +16590,7 @@
           <w:highlight w:val="yellow"/>
           <w:lang w:val="pt-BR"/>
         </w:rPr>
-        <w:t xml:space="preserve">Sujeita às seguintes </w:t>
-      </w:r>
-      <w:r>
-        <w:rPr>
-          <w:highlight w:val="yellow"/>
-          <w:lang w:val="pt-BR"/>
-        </w:rPr>
-        <w:lastRenderedPageBreak/>
-        <w:t>alíquotas:</w:t>
+        <w:t>Sujeita às seguintes alíquotas:</w:t>
       </w:r>
       <w:r>
         <w:rPr>
@@ -16518,7 +17141,14 @@
         <w:rPr>
           <w:lang w:val="pt-BR"/>
         </w:rPr>
-        <w:t xml:space="preserve">É vedado à Administradora, à Gestora, ao Custodiante e às suas partes relacionadas ceder ou originar, direta ou indiretamente, Direitos Creditórios ao Fundo, nos termos da regulamentação aplicável. </w:t>
+        <w:t xml:space="preserve">É vedado à Administradora, à Gestora, ao Custodiante e às suas partes relacionadas ceder ou originar, direta ou indiretamente, Direitos Creditórios ao Fundo, nos termos da regulamentação </w:t>
+      </w:r>
+      <w:r>
+        <w:rPr>
+          <w:lang w:val="pt-BR"/>
+        </w:rPr>
+        <w:lastRenderedPageBreak/>
+        <w:t xml:space="preserve">aplicável. </w:t>
       </w:r>
     </w:p>
     <w:p>
@@ -16548,8 +17178,59 @@
         <w:rPr>
           <w:lang w:val="pt-BR"/>
         </w:rPr>
-        <w:lastRenderedPageBreak/>
-        <w:t>As operações envolvendo partes relacionadas no período de 10 de janeiro de 2025 (início das atividades) a 31 de agosto de 2025 está assim apresentada:</w:t>
+        <w:t xml:space="preserve">As operações envolvendo partes relacionadas no período de </w:t>
+      </w:r>
+      <w:r>
+        <w:rPr>
+          <w:lang w:val="pt-BR"/>
+        </w:rPr>
+        <w:t>{{</w:t>
+      </w:r>
+      <w:proofErr w:type="spellStart"/>
+      <w:r>
+        <w:rPr>
+          <w:lang w:val="pt-BR"/>
+        </w:rPr>
+        <w:t>data_anterior_extenso</w:t>
+      </w:r>
+      <w:proofErr w:type="spellEnd"/>
+      <w:r>
+        <w:rPr>
+          <w:lang w:val="pt-BR"/>
+        </w:rPr>
+        <w:t>}}</w:t>
+      </w:r>
+      <w:r>
+        <w:rPr>
+          <w:lang w:val="pt-BR"/>
+        </w:rPr>
+        <w:t xml:space="preserve"> (início das atividades) a </w:t>
+      </w:r>
+      <w:r>
+        <w:rPr>
+          <w:lang w:val="pt-BR"/>
+        </w:rPr>
+        <w:t>{{</w:t>
+      </w:r>
+      <w:proofErr w:type="spellStart"/>
+      <w:r>
+        <w:rPr>
+          <w:lang w:val="pt-BR"/>
+        </w:rPr>
+        <w:t>data_atual_extenso</w:t>
+      </w:r>
+      <w:proofErr w:type="spellEnd"/>
+      <w:r>
+        <w:rPr>
+          <w:lang w:val="pt-BR"/>
+        </w:rPr>
+        <w:t>}}</w:t>
+      </w:r>
+      <w:r>
+        <w:rPr>
+          <w:lang w:val="pt-BR"/>
+        </w:rPr>
+        <w:t xml:space="preserve"> está assim apresentada:</w:t>
       </w:r>
     </w:p>
     <w:p>
@@ -16967,7 +17648,48 @@
                 <w:u w:val="single"/>
                 <w:lang w:val="pt-BR" w:eastAsia="pt-BR"/>
               </w:rPr>
-              <w:t>Período findo em 31/08/2025</w:t>
+              <w:t xml:space="preserve">Período findo em </w:t>
+            </w:r>
+            <w:r>
+              <w:rPr>
+                <w:rFonts w:eastAsia="Times New Roman"/>
+                <w:b/>
+                <w:bCs/>
+                <w:color w:val="000000"/>
+                <w:sz w:val="20"/>
+                <w:szCs w:val="20"/>
+                <w:u w:val="single"/>
+                <w:lang w:val="pt-BR" w:eastAsia="pt-BR"/>
+              </w:rPr>
+              <w:t>{{</w:t>
+            </w:r>
+            <w:proofErr w:type="spellStart"/>
+            <w:r>
+              <w:rPr>
+                <w:rFonts w:eastAsia="Times New Roman"/>
+                <w:b/>
+                <w:bCs/>
+                <w:color w:val="000000"/>
+                <w:sz w:val="20"/>
+                <w:szCs w:val="20"/>
+                <w:u w:val="single"/>
+                <w:lang w:val="pt-BR" w:eastAsia="pt-BR"/>
+              </w:rPr>
+              <w:t>data_atual</w:t>
+            </w:r>
+            <w:proofErr w:type="spellEnd"/>
+            <w:r>
+              <w:rPr>
+                <w:rFonts w:eastAsia="Times New Roman"/>
+                <w:b/>
+                <w:bCs/>
+                <w:color w:val="000000"/>
+                <w:sz w:val="20"/>
+                <w:szCs w:val="20"/>
+                <w:u w:val="single"/>
+                <w:lang w:val="pt-BR" w:eastAsia="pt-BR"/>
+              </w:rPr>
+              <w:t>}}</w:t>
             </w:r>
           </w:p>
         </w:tc>
@@ -18451,7 +19173,15 @@
           <w:highlight w:val="yellow"/>
           <w:lang w:val="pt-BR"/>
         </w:rPr>
-        <w:t>O Administrador coloca à disposição dos interessados, na sede do Administrador, as seguintes informações: (i) Diariamente, o valor da cota e do patrimônio líquido do Fundo; (ii) Mensalmente, até 10 dias após o encerramento do mês a que se referirem o balancete, demonstrativo de composição e diversificação da carteira e informações relativas ao perfil mensal; e (iii) Anualmente, no prazo de até 90 dias contados a partir do encerramento do exercício a que se referirem, as demonstrações financeiras acompanhadas do parecer do auditor independente. O Administrador disponibiliza aos cotistas, mensalmente, extrato de conta contendo o saldo e o valor das cotas no início e no final no período e a movimentação ocorrida ao longo do mesmo e rentabilidade do Fundo auferido entre o último dia útil do mês anterior e o último dia útil do mês de referência do extrato.</w:t>
+        <w:t xml:space="preserve">O Administrador coloca à disposição dos interessados, na sede do Administrador, as seguintes informações: (i) Diariamente, o valor da cota e do patrimônio líquido do Fundo; (ii) Mensalmente, até 10 dias após o encerramento do mês a que se referirem o balancete, demonstrativo de composição e diversificação da carteira e informações relativas ao perfil mensal; e (iii) Anualmente, no prazo de até 90 dias contados a partir do encerramento do exercício a que se referirem, as demonstrações financeiras acompanhadas do parecer do auditor independente. O Administrador disponibiliza aos cotistas, mensalmente, extrato de conta contendo o saldo e o valor das cotas no início e no final no período e a movimentação ocorrida </w:t>
+      </w:r>
+      <w:r>
+        <w:rPr>
+          <w:highlight w:val="yellow"/>
+          <w:lang w:val="pt-BR"/>
+        </w:rPr>
+        <w:lastRenderedPageBreak/>
+        <w:t>ao longo do mesmo e rentabilidade do Fundo auferido entre o último dia útil do mês anterior e o último dia útil do mês de referência do extrato.</w:t>
       </w:r>
       <w:r>
         <w:rPr>
@@ -18528,7 +19258,67 @@
           <w:highlight w:val="cyan"/>
           <w:lang w:val="pt-BR"/>
         </w:rPr>
-        <w:t>No período de 10 de janeiro de 2025 (início das atividades) a 31 de agosto de 2025, não houve assembleias de cotistas.</w:t>
+        <w:t xml:space="preserve">No período de </w:t>
+      </w:r>
+      <w:r>
+        <w:rPr>
+          <w:highlight w:val="cyan"/>
+          <w:lang w:val="pt-BR"/>
+        </w:rPr>
+        <w:t>{{</w:t>
+      </w:r>
+      <w:proofErr w:type="spellStart"/>
+      <w:r>
+        <w:rPr>
+          <w:highlight w:val="cyan"/>
+          <w:lang w:val="pt-BR"/>
+        </w:rPr>
+        <w:t>data_anterior_extenso</w:t>
+      </w:r>
+      <w:proofErr w:type="spellEnd"/>
+      <w:r>
+        <w:rPr>
+          <w:highlight w:val="cyan"/>
+          <w:lang w:val="pt-BR"/>
+        </w:rPr>
+        <w:t>}}</w:t>
+      </w:r>
+      <w:r>
+        <w:rPr>
+          <w:highlight w:val="cyan"/>
+          <w:lang w:val="pt-BR"/>
+        </w:rPr>
+        <w:t xml:space="preserve"> (início das atividades) a </w:t>
+      </w:r>
+      <w:r>
+        <w:rPr>
+          <w:highlight w:val="cyan"/>
+          <w:lang w:val="pt-BR"/>
+        </w:rPr>
+        <w:t>{{</w:t>
+      </w:r>
+      <w:proofErr w:type="spellStart"/>
+      <w:r>
+        <w:rPr>
+          <w:highlight w:val="cyan"/>
+          <w:lang w:val="pt-BR"/>
+        </w:rPr>
+        <w:t>data_atual_extenso</w:t>
+      </w:r>
+      <w:proofErr w:type="spellEnd"/>
+      <w:r>
+        <w:rPr>
+          <w:highlight w:val="cyan"/>
+          <w:lang w:val="pt-BR"/>
+        </w:rPr>
+        <w:t>}}</w:t>
+      </w:r>
+      <w:r>
+        <w:rPr>
+          <w:highlight w:val="cyan"/>
+          <w:lang w:val="pt-BR"/>
+        </w:rPr>
+        <w:t>, não houve assembleias de cotistas.</w:t>
       </w:r>
     </w:p>
     <w:p>
@@ -19077,15 +19867,13 @@
       <w:jc w:val="both"/>
       <w:rPr>
         <w:b/>
-        <w:highlight w:val="yellow"/>
       </w:rPr>
     </w:pPr>
     <w:r>
       <w:rPr>
         <w:b/>
-        <w:highlight w:val="yellow"/>
       </w:rPr>
-      <w:t>MATTEH FUNDO DE INVESTIMENTO EM DIREITOS CREDITÓRIOS</w:t>
+      <w:t>{{fundo_nome}}</w:t>
     </w:r>
   </w:p>
   <w:p>
@@ -19094,32 +19882,19 @@
       <w:jc w:val="both"/>
       <w:rPr>
         <w:b/>
-        <w:highlight w:val="yellow"/>
       </w:rPr>
     </w:pPr>
     <w:r>
       <w:rPr>
         <w:b/>
-        <w:highlight w:val="yellow"/>
       </w:rPr>
-      <w:t>CNPJ: 58.723.201/0001-05</w:t>
+      <w:t xml:space="preserve">CNPJ: </w:t>
     </w:r>
-  </w:p>
-  <w:p>
-    <w:pPr>
-      <w:pStyle w:val="Corpodetexto"/>
-      <w:jc w:val="both"/>
-      <w:rPr>
-        <w:bCs/>
-        <w:highlight w:val="yellow"/>
-      </w:rPr>
-    </w:pPr>
     <w:r>
       <w:rPr>
-        <w:bCs/>
-        <w:highlight w:val="yellow"/>
+        <w:b/>
       </w:rPr>
-      <w:t>Administrado pela Master S.A. Corretora de Câmbio, Títulos e Valores Mobiliários</w:t>
+      <w:t>{{fundo_cnpj}}</w:t>
     </w:r>
   </w:p>
   <w:p>
@@ -19133,9 +19908,29 @@
     <w:r>
       <w:rPr>
         <w:bCs/>
-        <w:highlight w:val="yellow"/>
       </w:rPr>
-      <w:t>CNPJ: 33.886.862/0001-12</w:t>
+      <w:t>{{empresa_nome}}</w:t>
+    </w:r>
+  </w:p>
+  <w:p>
+    <w:pPr>
+      <w:pStyle w:val="Corpodetexto"/>
+      <w:jc w:val="both"/>
+      <w:rPr>
+        <w:bCs/>
+      </w:rPr>
+    </w:pPr>
+    <w:r>
+      <w:rPr>
+        <w:bCs/>
+      </w:rPr>
+      <w:t xml:space="preserve">CNPJ: </w:t>
+    </w:r>
+    <w:r>
+      <w:rPr>
+        <w:bCs/>
+      </w:rPr>
+      <w:t>{{empresa_cnpj}}</w:t>
     </w:r>
   </w:p>
   <w:p>
@@ -19158,22 +19953,26 @@
     <w:r>
       <w:rPr>
         <w:b/>
-        <w:highlight w:val="yellow"/>
       </w:rPr>
-      <w:t>Notas Explicativas da Administração às Demonstrações Financeiras</w:t>
+      <w:t xml:space="preserve">Notas Explicativas da Administração às Demonstrações Financeiras do período de </w:t>
     </w:r>
     <w:r>
       <w:rPr>
         <w:b/>
       </w:rPr>
-      <w:t xml:space="preserve"> </w:t>
+      <w:t>{{data_anterior_extenso}}</w:t>
     </w:r>
     <w:r>
       <w:rPr>
         <w:b/>
-        <w:highlight w:val="cyan"/>
       </w:rPr>
-      <w:t>do período de 10 de janeiro de 2025 (início das atividades) a 31 de agosto de 2025</w:t>
+      <w:t xml:space="preserve"> (início das atividades) a </w:t>
+    </w:r>
+    <w:r>
+      <w:rPr>
+        <w:b/>
+      </w:rPr>
+      <w:t>{{data_atual_extenso}}</w:t>
     </w:r>
   </w:p>
   <w:p>
@@ -19190,7 +19989,6 @@
     <w:r>
       <w:rPr>
         <w:bCs/>
-        <w:highlight w:val="yellow"/>
       </w:rPr>
       <w:t>(Valores expressos em milhares de reais, exceto quando indicado de outra forma)</w:t>
     </w:r>
@@ -43328,10 +44126,6 @@
 </file>
 
 <file path=customXml/item1.xml><?xml version="1.0" encoding="utf-8"?>
-<b:Sources xmlns:b="http://schemas.openxmlformats.org/officeDocument/2006/bibliography" xmlns="http://schemas.openxmlformats.org/officeDocument/2006/bibliography" SelectedStyle="\APASixthEditionOfficeOnline.xsl" StyleName="APA" Version="6"/>
-</file>
-
-<file path=customXml/item2.xml><?xml version="1.0" encoding="utf-8"?>
 <ct:contentTypeSchema xmlns:ct="http://schemas.microsoft.com/office/2006/metadata/contentType" xmlns:ma="http://schemas.microsoft.com/office/2006/metadata/properties/metaAttributes" ct:_="" ma:_="" ma:contentTypeName="Documento" ma:contentTypeID="0x010100D13D5EF70A9DD84ABB30436F756FCB67" ma:contentTypeVersion="20" ma:contentTypeDescription="Crie um novo documento." ma:contentTypeScope="" ma:versionID="082d1ecbad6b8066d2921f4fe8b7e2f8">
   <xsd:schema xmlns:xsd="http://www.w3.org/2001/XMLSchema" xmlns:xs="http://www.w3.org/2001/XMLSchema" xmlns:p="http://schemas.microsoft.com/office/2006/metadata/properties" xmlns:ns2="56c0da9d-257c-4e89-a2a2-2f15d7acb537" xmlns:ns3="109a4d02-1817-4ce2-87de-6ebc416195a0" targetNamespace="http://schemas.microsoft.com/office/2006/metadata/properties" ma:root="true" ma:fieldsID="edfdbe7ff08548143f9ce617eb30e3af" ns2:_="" ns3:_="">
     <xsd:import namespace="56c0da9d-257c-4e89-a2a2-2f15d7acb537"/>
@@ -43612,7 +44406,7 @@
 </ct:contentTypeSchema>
 </file>
 
-<file path=customXml/item3.xml><?xml version="1.0" encoding="utf-8"?>
+<file path=customXml/item2.xml><?xml version="1.0" encoding="utf-8"?>
 <p:properties xmlns:p="http://schemas.microsoft.com/office/2006/metadata/properties" xmlns:xsi="http://www.w3.org/2001/XMLSchema-instance" xmlns:pc="http://schemas.microsoft.com/office/infopath/2007/PartnerControls">
   <documentManagement>
     <TaxCatchAll xmlns="109a4d02-1817-4ce2-87de-6ebc416195a0" xsi:nil="true"/>
@@ -43631,7 +44425,7 @@
 </p:properties>
 </file>
 
-<file path=customXml/item4.xml><?xml version="1.0" encoding="utf-8"?>
+<file path=customXml/item3.xml><?xml version="1.0" encoding="utf-8"?>
 <?mso-contentType ?>
 <FormTemplates xmlns="http://schemas.microsoft.com/sharepoint/v3/contenttype/forms">
   <Display>DocumentLibraryForm</Display>
@@ -43640,15 +44434,11 @@
 </FormTemplates>
 </file>
 
-<file path=customXml/itemProps1.xml><?xml version="1.0" encoding="utf-8"?>
-<ds:datastoreItem xmlns:ds="http://schemas.openxmlformats.org/officeDocument/2006/customXml" ds:itemID="{4982EC73-8EC2-40B9-B033-5880B4E7DB5F}">
-  <ds:schemaRefs>
-    <ds:schemaRef ds:uri="http://schemas.openxmlformats.org/officeDocument/2006/bibliography"/>
-  </ds:schemaRefs>
-</ds:datastoreItem>
+<file path=customXml/item4.xml><?xml version="1.0" encoding="utf-8"?>
+<b:Sources xmlns:b="http://schemas.openxmlformats.org/officeDocument/2006/bibliography" xmlns="http://schemas.openxmlformats.org/officeDocument/2006/bibliography" SelectedStyle="\APASixthEditionOfficeOnline.xsl" StyleName="APA" Version="6"/>
 </file>
 
-<file path=customXml/itemProps2.xml><?xml version="1.0" encoding="utf-8"?>
+<file path=customXml/itemProps1.xml><?xml version="1.0" encoding="utf-8"?>
 <ds:datastoreItem xmlns:ds="http://schemas.openxmlformats.org/officeDocument/2006/customXml" ds:itemID="{560E6882-23BC-4A43-B906-03365F9FEA7F}">
   <ds:schemaRefs>
     <ds:schemaRef ds:uri="http://schemas.microsoft.com/office/2006/metadata/contentType"/>
@@ -43667,7 +44457,7 @@
 </ds:datastoreItem>
 </file>
 
-<file path=customXml/itemProps3.xml><?xml version="1.0" encoding="utf-8"?>
+<file path=customXml/itemProps2.xml><?xml version="1.0" encoding="utf-8"?>
 <ds:datastoreItem xmlns:ds="http://schemas.openxmlformats.org/officeDocument/2006/customXml" ds:itemID="{1BBCBA59-0A97-493C-9300-046612EDAE49}">
   <ds:schemaRefs>
     <ds:schemaRef ds:uri="http://schemas.microsoft.com/office/2006/metadata/properties"/>
@@ -43678,10 +44468,18 @@
 </ds:datastoreItem>
 </file>
 
-<file path=customXml/itemProps4.xml><?xml version="1.0" encoding="utf-8"?>
+<file path=customXml/itemProps3.xml><?xml version="1.0" encoding="utf-8"?>
 <ds:datastoreItem xmlns:ds="http://schemas.openxmlformats.org/officeDocument/2006/customXml" ds:itemID="{4FBC6844-159D-4CBB-B0AC-B9A02A1945B7}">
   <ds:schemaRefs>
     <ds:schemaRef ds:uri="http://schemas.microsoft.com/sharepoint/v3/contenttype/forms"/>
   </ds:schemaRefs>
 </ds:datastoreItem>
+</file>
+
+<file path=customXml/itemProps4.xml><?xml version="1.0" encoding="utf-8"?>
+<ds:datastoreItem xmlns:ds="http://schemas.openxmlformats.org/officeDocument/2006/customXml" ds:itemID="{4982EC73-8EC2-40B9-B033-5880B4E7DB5F}">
+  <ds:schemaRefs>
+    <ds:schemaRef ds:uri="http://schemas.openxmlformats.org/officeDocument/2006/bibliography"/>
+  </ds:schemaRefs>
+</ds:datastoreItem>
 </file>
</xml_diff>